<commit_message>
Bracewell: restore the Morrissey and Cure passages as ordinary paragraphs
Co-Authored-By: Claude Sonnet 5.5 <noreply@anthropic.com>
</commit_message>
<xml_diff>
--- a/content-src/docx/R G 1997 05 22 Bracewell.docx
+++ b/content-src/docx/R G 1997 05 22 Bracewell.docx
@@ -32,22 +32,19 @@
     </w:p>
     <w:p>
       <w:r>
-        <w:t xml:space="preserve">&lt;quote&gt;</w:t>
-      </w:r>
-      <w:r>
         <w:t xml:space="preserve">“I decree today that life is simply taking and not gi</w:t>
       </w:r>
       <w:r>
         <w:t xml:space="preserve">ving;</w:t>
       </w:r>
       <w:r>
-        <w:br/>
+        <w:t xml:space="preserve"> / </w:t>
       </w:r>
       <w:r>
         <w:t xml:space="preserve">England is mine</w:t>
       </w:r>
       <w:r>
-        <w:br/>
+        <w:t xml:space="preserve"> / </w:t>
       </w:r>
       <w:r>
         <w:t xml:space="preserve">And it owes me a living</w:t>
@@ -67,9 +64,6 @@
       <w:r>
         <w:t xml:space="preserve">.”</w:t>
       </w:r>
-      <w:r>
-        <w:t xml:space="preserve">&lt;/quote&gt;</w:t>
-      </w:r>
     </w:p>
     <w:p>
       <w:r>
@@ -102,16 +96,13 @@
         <w:t xml:space="preserve">Why, in this context, Bracewell should devote five pages to slagging off a group like the Cure is hard to explain, but he does, with this deft rhetoric: </w:t>
       </w:r>
       <w:r>
-        <w:t xml:space="preserve">&lt;quote&gt;</w:t>
+        <w:t xml:space="preserve">"</w:t>
       </w:r>
       <w:r>
         <w:t xml:space="preserve">And it could be argued, in fact, that the pop sound of suburbia has been defined by the melodramatic, monolithic music of the Cure, in which an eerie monotony gives service to morbidity</w:t>
       </w:r>
       <w:r>
-        <w:t xml:space="preserve">.</w:t>
-      </w:r>
-      <w:r>
-        <w:t xml:space="preserve">&lt;/quote&gt;</w:t>
+        <w:t xml:space="preserve">".</w:t>
       </w:r>
       <w:r>
         <w:t xml:space="preserve"> If this alliterative thesis could, in fact, be argued, Bracewell doesn't bother. What he means – I think – is that the essence of suburbia is boredom, and that Robert Smi</w:t>

</xml_diff>